<commit_message>
Host resume in git with sync workflow and update latest DOCX/PDF.
</commit_message>
<xml_diff>
--- a/public/Farhan-Tahmid-Resume.docx
+++ b/public/Farhan-Tahmid-Resume.docx
@@ -147,7 +147,7 @@
         <w:pStyle w:val="ListParagraph"/>
         <w:numPr>
           <w:ilvl w:val="0"/>
-          <w:numId w:val="3"/>
+          <w:numId w:val="4"/>
         </w:numPr>
         <w:spacing w:before="0" w:after="60"/>
         <w:rPr/>
@@ -166,7 +166,7 @@
         <w:pStyle w:val="ListParagraph"/>
         <w:numPr>
           <w:ilvl w:val="0"/>
-          <w:numId w:val="1"/>
+          <w:numId w:val="2"/>
         </w:numPr>
         <w:spacing w:before="0" w:after="60"/>
         <w:rPr/>
@@ -185,7 +185,7 @@
         <w:pStyle w:val="ListParagraph"/>
         <w:numPr>
           <w:ilvl w:val="0"/>
-          <w:numId w:val="1"/>
+          <w:numId w:val="2"/>
         </w:numPr>
         <w:spacing w:before="0" w:after="60"/>
         <w:rPr/>
@@ -204,7 +204,7 @@
         <w:pStyle w:val="ListParagraph"/>
         <w:numPr>
           <w:ilvl w:val="0"/>
-          <w:numId w:val="1"/>
+          <w:numId w:val="2"/>
         </w:numPr>
         <w:spacing w:before="0" w:after="60"/>
         <w:rPr/>
@@ -240,7 +240,7 @@
         <w:pStyle w:val="ListParagraph"/>
         <w:numPr>
           <w:ilvl w:val="0"/>
-          <w:numId w:val="1"/>
+          <w:numId w:val="2"/>
         </w:numPr>
         <w:spacing w:before="0" w:after="60"/>
         <w:rPr/>
@@ -259,7 +259,7 @@
         <w:pStyle w:val="ListParagraph"/>
         <w:numPr>
           <w:ilvl w:val="0"/>
-          <w:numId w:val="1"/>
+          <w:numId w:val="2"/>
         </w:numPr>
         <w:spacing w:before="0" w:after="60"/>
         <w:rPr/>
@@ -278,7 +278,7 @@
         <w:pStyle w:val="ListParagraph"/>
         <w:numPr>
           <w:ilvl w:val="0"/>
-          <w:numId w:val="1"/>
+          <w:numId w:val="2"/>
         </w:numPr>
         <w:spacing w:before="0" w:after="60"/>
         <w:rPr/>
@@ -340,7 +340,7 @@
         <w:pStyle w:val="ListParagraph"/>
         <w:numPr>
           <w:ilvl w:val="0"/>
-          <w:numId w:val="1"/>
+          <w:numId w:val="2"/>
         </w:numPr>
         <w:spacing w:before="0" w:after="60"/>
         <w:rPr/>
@@ -359,7 +359,7 @@
         <w:pStyle w:val="ListParagraph"/>
         <w:numPr>
           <w:ilvl w:val="0"/>
-          <w:numId w:val="1"/>
+          <w:numId w:val="2"/>
         </w:numPr>
         <w:spacing w:before="0" w:after="60"/>
         <w:rPr/>
@@ -378,7 +378,7 @@
         <w:pStyle w:val="ListParagraph"/>
         <w:numPr>
           <w:ilvl w:val="0"/>
-          <w:numId w:val="1"/>
+          <w:numId w:val="2"/>
         </w:numPr>
         <w:spacing w:before="0" w:after="60"/>
         <w:rPr/>
@@ -417,7 +417,7 @@
         <w:pStyle w:val="ListParagraph"/>
         <w:numPr>
           <w:ilvl w:val="0"/>
-          <w:numId w:val="1"/>
+          <w:numId w:val="2"/>
         </w:numPr>
         <w:spacing w:before="0" w:after="70"/>
         <w:rPr/>
@@ -456,7 +456,7 @@
         <w:pStyle w:val="ListParagraph"/>
         <w:numPr>
           <w:ilvl w:val="0"/>
-          <w:numId w:val="1"/>
+          <w:numId w:val="2"/>
         </w:numPr>
         <w:spacing w:before="0" w:after="70"/>
         <w:rPr/>
@@ -495,7 +495,7 @@
         <w:pStyle w:val="ListParagraph"/>
         <w:numPr>
           <w:ilvl w:val="0"/>
-          <w:numId w:val="1"/>
+          <w:numId w:val="2"/>
         </w:numPr>
         <w:spacing w:before="0" w:after="70"/>
         <w:rPr/>
@@ -534,7 +534,7 @@
         <w:pStyle w:val="ListParagraph"/>
         <w:numPr>
           <w:ilvl w:val="0"/>
-          <w:numId w:val="1"/>
+          <w:numId w:val="2"/>
         </w:numPr>
         <w:spacing w:before="0" w:after="70"/>
         <w:rPr/>
@@ -573,7 +573,7 @@
         <w:pStyle w:val="ListParagraph"/>
         <w:numPr>
           <w:ilvl w:val="0"/>
-          <w:numId w:val="1"/>
+          <w:numId w:val="2"/>
         </w:numPr>
         <w:spacing w:before="0" w:after="70"/>
         <w:rPr/>
@@ -788,7 +788,31 @@
           <w:sz w:val="18"/>
           <w:szCs w:val="18"/>
         </w:rPr>
-        <w:t>Beginning Fall 2026</w:t>
+        <w:t>Expected Spring</w:t>
+      </w:r>
+      <w:r>
+        <w:rPr>
+          <w:b w:val="false"/>
+          <w:bCs w:val="false"/>
+          <w:i/>
+          <w:iCs/>
+          <w:color w:val="auto"/>
+          <w:sz w:val="18"/>
+          <w:szCs w:val="18"/>
+        </w:rPr>
+        <w:t xml:space="preserve"> 202</w:t>
+      </w:r>
+      <w:r>
+        <w:rPr>
+          <w:b w:val="false"/>
+          <w:bCs w:val="false"/>
+          <w:i/>
+          <w:iCs/>
+          <w:color w:val="auto"/>
+          <w:sz w:val="18"/>
+          <w:szCs w:val="18"/>
+        </w:rPr>
+        <w:t>8</w:t>
       </w:r>
     </w:p>
     <w:p>
@@ -878,6 +902,7 @@
         </w:tabs>
         <w:ind w:start="1080" w:hanging="360"/>
       </w:pPr>
+      <w:rPr/>
     </w:lvl>
     <w:lvl w:ilvl="2">
       <w:start w:val="1"/>
@@ -890,6 +915,7 @@
         </w:tabs>
         <w:ind w:start="1440" w:hanging="360"/>
       </w:pPr>
+      <w:rPr/>
     </w:lvl>
     <w:lvl w:ilvl="3">
       <w:start w:val="1"/>
@@ -902,6 +928,7 @@
         </w:tabs>
         <w:ind w:start="1800" w:hanging="360"/>
       </w:pPr>
+      <w:rPr/>
     </w:lvl>
     <w:lvl w:ilvl="4">
       <w:start w:val="1"/>
@@ -914,6 +941,7 @@
         </w:tabs>
         <w:ind w:start="2160" w:hanging="360"/>
       </w:pPr>
+      <w:rPr/>
     </w:lvl>
     <w:lvl w:ilvl="5">
       <w:start w:val="1"/>
@@ -926,6 +954,7 @@
         </w:tabs>
         <w:ind w:start="2520" w:hanging="360"/>
       </w:pPr>
+      <w:rPr/>
     </w:lvl>
     <w:lvl w:ilvl="6">
       <w:start w:val="1"/>
@@ -938,6 +967,7 @@
         </w:tabs>
         <w:ind w:start="2880" w:hanging="360"/>
       </w:pPr>
+      <w:rPr/>
     </w:lvl>
     <w:lvl w:ilvl="7">
       <w:start w:val="1"/>
@@ -950,6 +980,7 @@
         </w:tabs>
         <w:ind w:start="3240" w:hanging="360"/>
       </w:pPr>
+      <w:rPr/>
     </w:lvl>
     <w:lvl w:ilvl="8">
       <w:start w:val="1"/>
@@ -962,9 +993,131 @@
         </w:tabs>
         <w:ind w:start="3600" w:hanging="360"/>
       </w:pPr>
+      <w:rPr/>
     </w:lvl>
   </w:abstractNum>
   <w:abstractNum w:abstractNumId="2">
+    <w:lvl w:ilvl="0">
+      <w:start w:val="1"/>
+      <w:numFmt w:val="bullet"/>
+      <w:lvlText w:val=""/>
+      <w:lvlJc w:val="start"/>
+      <w:pPr>
+        <w:tabs>
+          <w:tab w:val="num" w:pos="0"/>
+        </w:tabs>
+        <w:ind w:start="259" w:hanging="201"/>
+      </w:pPr>
+      <w:rPr>
+        <w:rFonts w:ascii="Symbol" w:hAnsi="Symbol" w:cs="Symbol" w:hint="default"/>
+      </w:rPr>
+    </w:lvl>
+    <w:lvl w:ilvl="1">
+      <w:start w:val="1"/>
+      <w:numFmt w:val="decimal"/>
+      <w:lvlText w:val="%2."/>
+      <w:lvlJc w:val="start"/>
+      <w:pPr>
+        <w:tabs>
+          <w:tab w:val="num" w:pos="1080"/>
+        </w:tabs>
+        <w:ind w:start="1080" w:hanging="360"/>
+      </w:pPr>
+      <w:rPr/>
+    </w:lvl>
+    <w:lvl w:ilvl="2">
+      <w:start w:val="1"/>
+      <w:numFmt w:val="decimal"/>
+      <w:lvlText w:val="%3."/>
+      <w:lvlJc w:val="start"/>
+      <w:pPr>
+        <w:tabs>
+          <w:tab w:val="num" w:pos="1440"/>
+        </w:tabs>
+        <w:ind w:start="1440" w:hanging="360"/>
+      </w:pPr>
+      <w:rPr/>
+    </w:lvl>
+    <w:lvl w:ilvl="3">
+      <w:start w:val="1"/>
+      <w:numFmt w:val="decimal"/>
+      <w:lvlText w:val="%4."/>
+      <w:lvlJc w:val="start"/>
+      <w:pPr>
+        <w:tabs>
+          <w:tab w:val="num" w:pos="1800"/>
+        </w:tabs>
+        <w:ind w:start="1800" w:hanging="360"/>
+      </w:pPr>
+      <w:rPr/>
+    </w:lvl>
+    <w:lvl w:ilvl="4">
+      <w:start w:val="1"/>
+      <w:numFmt w:val="decimal"/>
+      <w:lvlText w:val="%5."/>
+      <w:lvlJc w:val="start"/>
+      <w:pPr>
+        <w:tabs>
+          <w:tab w:val="num" w:pos="2160"/>
+        </w:tabs>
+        <w:ind w:start="2160" w:hanging="360"/>
+      </w:pPr>
+      <w:rPr/>
+    </w:lvl>
+    <w:lvl w:ilvl="5">
+      <w:start w:val="1"/>
+      <w:numFmt w:val="decimal"/>
+      <w:lvlText w:val="%6."/>
+      <w:lvlJc w:val="start"/>
+      <w:pPr>
+        <w:tabs>
+          <w:tab w:val="num" w:pos="2520"/>
+        </w:tabs>
+        <w:ind w:start="2520" w:hanging="360"/>
+      </w:pPr>
+      <w:rPr/>
+    </w:lvl>
+    <w:lvl w:ilvl="6">
+      <w:start w:val="1"/>
+      <w:numFmt w:val="decimal"/>
+      <w:lvlText w:val="%7."/>
+      <w:lvlJc w:val="start"/>
+      <w:pPr>
+        <w:tabs>
+          <w:tab w:val="num" w:pos="2880"/>
+        </w:tabs>
+        <w:ind w:start="2880" w:hanging="360"/>
+      </w:pPr>
+      <w:rPr/>
+    </w:lvl>
+    <w:lvl w:ilvl="7">
+      <w:start w:val="1"/>
+      <w:numFmt w:val="decimal"/>
+      <w:lvlText w:val="%8."/>
+      <w:lvlJc w:val="start"/>
+      <w:pPr>
+        <w:tabs>
+          <w:tab w:val="num" w:pos="3240"/>
+        </w:tabs>
+        <w:ind w:start="3240" w:hanging="360"/>
+      </w:pPr>
+      <w:rPr/>
+    </w:lvl>
+    <w:lvl w:ilvl="8">
+      <w:start w:val="1"/>
+      <w:numFmt w:val="decimal"/>
+      <w:lvlText w:val="%9."/>
+      <w:lvlJc w:val="start"/>
+      <w:pPr>
+        <w:tabs>
+          <w:tab w:val="num" w:pos="3600"/>
+        </w:tabs>
+        <w:ind w:start="3600" w:hanging="360"/>
+      </w:pPr>
+      <w:rPr/>
+    </w:lvl>
+  </w:abstractNum>
+  <w:abstractNum w:abstractNumId="3">
     <w:lvl w:ilvl="0">
       <w:start w:val="1"/>
       <w:numFmt w:val="none"/>
@@ -1090,7 +1243,10 @@
     <w:abstractNumId w:val="2"/>
   </w:num>
   <w:num w:numId="3">
-    <w:abstractNumId w:val="1"/>
+    <w:abstractNumId w:val="3"/>
+  </w:num>
+  <w:num w:numId="4">
+    <w:abstractNumId w:val="2"/>
     <w:lvlOverride w:ilvl="0">
       <w:startOverride w:val="1"/>
     </w:lvlOverride>
@@ -1118,6 +1274,7 @@
     <w:qFormat/>
     <w:pPr>
       <w:widowControl/>
+      <w:suppressAutoHyphens w:val="true"/>
       <w:bidi w:val="0"/>
       <w:spacing w:before="0" w:after="0"/>
       <w:jc w:val="start"/>
@@ -1202,11 +1359,18 @@
       <w:u w:val="single"/>
     </w:rPr>
   </w:style>
-  <w:style w:type="character" w:styleId="FootnoteCharacters">
-    <w:name w:val="Footnote Characters"/>
+  <w:style w:type="character" w:styleId="FootnoteCharactersuser">
+    <w:name w:val="Footnote Characters (user)"/>
     <w:uiPriority w:val="99"/>
     <w:semiHidden/>
     <w:unhideWhenUsed/>
+    <w:qFormat/>
+    <w:rPr>
+      <w:vertAlign w:val="superscript"/>
+    </w:rPr>
+  </w:style>
+  <w:style w:type="character" w:styleId="FootnoteCharacters">
+    <w:name w:val="Footnote Characters"/>
     <w:qFormat/>
     <w:rPr>
       <w:vertAlign w:val="superscript"/>
@@ -1230,11 +1394,18 @@
       <w:szCs w:val="20"/>
     </w:rPr>
   </w:style>
-  <w:style w:type="character" w:styleId="EndnoteCharacters">
-    <w:name w:val="Endnote Characters"/>
+  <w:style w:type="character" w:styleId="EndnoteCharactersuser">
+    <w:name w:val="Endnote Characters (user)"/>
     <w:uiPriority w:val="99"/>
     <w:semiHidden/>
     <w:unhideWhenUsed/>
+    <w:qFormat/>
+    <w:rPr>
+      <w:vertAlign w:val="superscript"/>
+    </w:rPr>
+  </w:style>
+  <w:style w:type="character" w:styleId="EndnoteCharacters">
+    <w:name w:val="Endnote Characters"/>
     <w:qFormat/>
     <w:rPr>
       <w:vertAlign w:val="superscript"/>
@@ -1331,6 +1502,7 @@
     <w:qFormat/>
     <w:pPr>
       <w:widowControl/>
+      <w:suppressAutoHyphens w:val="true"/>
       <w:bidi w:val="0"/>
       <w:spacing w:before="0" w:after="0"/>
       <w:jc w:val="start"/>
@@ -1351,6 +1523,7 @@
     <w:qFormat/>
     <w:pPr>
       <w:widowControl/>
+      <w:suppressAutoHyphens w:val="true"/>
       <w:bidi w:val="0"/>
       <w:spacing w:before="0" w:after="0"/>
       <w:jc w:val="start"/>

</xml_diff>

<commit_message>
Update resume from latest Documents copy.
</commit_message>
<xml_diff>
--- a/public/Farhan-Tahmid-Resume.docx
+++ b/public/Farhan-Tahmid-Resume.docx
@@ -33,7 +33,39 @@
           <w:sz w:val="18"/>
           <w:szCs w:val="18"/>
         </w:rPr>
-        <w:t>farhantahmid007@gmail.com | (469) 912-5790 | github.com/tahmidft | Irving, TX | U.S. Citizen</w:t>
+        <w:t xml:space="preserve">farhantahmid007@gmail.com | </w:t>
+      </w:r>
+      <w:r>
+        <w:rPr>
+          <w:color w:val="555555"/>
+          <w:sz w:val="18"/>
+          <w:szCs w:val="18"/>
+        </w:rPr>
+        <w:t xml:space="preserve">+1 </w:t>
+      </w:r>
+      <w:r>
+        <w:rPr>
+          <w:color w:val="555555"/>
+          <w:sz w:val="18"/>
+          <w:szCs w:val="18"/>
+        </w:rPr>
+        <w:t xml:space="preserve">(469) 912-5790 | github.com/tahmidft | Irving, TX </w:t>
+      </w:r>
+      <w:r>
+        <w:rPr>
+          <w:color w:val="555555"/>
+          <w:sz w:val="18"/>
+          <w:szCs w:val="18"/>
+        </w:rPr>
+        <w:t>75038</w:t>
+      </w:r>
+      <w:r>
+        <w:rPr>
+          <w:color w:val="555555"/>
+          <w:sz w:val="18"/>
+          <w:szCs w:val="18"/>
+        </w:rPr>
+        <w:t xml:space="preserve"> | U.S. Citizen</w:t>
       </w:r>
     </w:p>
     <w:p>
@@ -109,28 +141,7 @@
           <w:szCs w:val="20"/>
         </w:rPr>
         <w:t xml:space="preserve">  |  Cloud Support Engineer I</w:t>
-        <w:tab/>
-        <w:tab/>
-      </w:r>
-      <w:r>
-        <w:rPr>
-          <w:b w:val="false"/>
-          <w:bCs w:val="false"/>
-          <w:i/>
-          <w:iCs/>
-          <w:color w:val="auto"/>
-          <w:sz w:val="18"/>
-          <w:szCs w:val="18"/>
-        </w:rPr>
-        <w:t>Feb 2023 – Feb 2025</w:t>
-      </w:r>
-    </w:p>
-    <w:p>
-      <w:pPr>
-        <w:pStyle w:val="Normal"/>
-        <w:spacing w:before="0" w:after="60"/>
-        <w:rPr/>
-      </w:pPr>
+      </w:r>
       <w:r>
         <w:rPr>
           <w:i/>
@@ -139,6 +150,25 @@
           <w:sz w:val="18"/>
           <w:szCs w:val="18"/>
         </w:rPr>
+        <w:tab/>
+        <w:tab/>
+        <w:t>Feb 2023 – Feb 2025</w:t>
+      </w:r>
+    </w:p>
+    <w:p>
+      <w:pPr>
+        <w:pStyle w:val="Normal"/>
+        <w:spacing w:before="0" w:after="60"/>
+        <w:rPr/>
+      </w:pPr>
+      <w:r>
+        <w:rPr>
+          <w:i/>
+          <w:iCs/>
+          <w:color w:val="555555"/>
+          <w:sz w:val="18"/>
+          <w:szCs w:val="18"/>
+        </w:rPr>
         <w:t>Internal SDE Internship</w:t>
       </w:r>
     </w:p>
@@ -147,7 +177,7 @@
         <w:pStyle w:val="ListParagraph"/>
         <w:numPr>
           <w:ilvl w:val="0"/>
-          <w:numId w:val="4"/>
+          <w:numId w:val="3"/>
         </w:numPr>
         <w:spacing w:before="0" w:after="60"/>
         <w:rPr/>
@@ -166,7 +196,7 @@
         <w:pStyle w:val="ListParagraph"/>
         <w:numPr>
           <w:ilvl w:val="0"/>
-          <w:numId w:val="2"/>
+          <w:numId w:val="1"/>
         </w:numPr>
         <w:spacing w:before="0" w:after="60"/>
         <w:rPr/>
@@ -185,7 +215,7 @@
         <w:pStyle w:val="ListParagraph"/>
         <w:numPr>
           <w:ilvl w:val="0"/>
-          <w:numId w:val="2"/>
+          <w:numId w:val="1"/>
         </w:numPr>
         <w:spacing w:before="0" w:after="60"/>
         <w:rPr/>
@@ -204,7 +234,7 @@
         <w:pStyle w:val="ListParagraph"/>
         <w:numPr>
           <w:ilvl w:val="0"/>
-          <w:numId w:val="2"/>
+          <w:numId w:val="1"/>
         </w:numPr>
         <w:spacing w:before="0" w:after="60"/>
         <w:rPr/>
@@ -240,7 +270,7 @@
         <w:pStyle w:val="ListParagraph"/>
         <w:numPr>
           <w:ilvl w:val="0"/>
-          <w:numId w:val="2"/>
+          <w:numId w:val="1"/>
         </w:numPr>
         <w:spacing w:before="0" w:after="60"/>
         <w:rPr/>
@@ -259,7 +289,7 @@
         <w:pStyle w:val="ListParagraph"/>
         <w:numPr>
           <w:ilvl w:val="0"/>
-          <w:numId w:val="2"/>
+          <w:numId w:val="1"/>
         </w:numPr>
         <w:spacing w:before="0" w:after="60"/>
         <w:rPr/>
@@ -278,7 +308,7 @@
         <w:pStyle w:val="ListParagraph"/>
         <w:numPr>
           <w:ilvl w:val="0"/>
-          <w:numId w:val="2"/>
+          <w:numId w:val="1"/>
         </w:numPr>
         <w:spacing w:before="0" w:after="60"/>
         <w:rPr/>
@@ -319,19 +349,17 @@
           <w:szCs w:val="20"/>
         </w:rPr>
         <w:t xml:space="preserve">  |  Contract</w:t>
+      </w:r>
+      <w:r>
+        <w:rPr>
+          <w:i/>
+          <w:iCs/>
+          <w:color w:val="555555"/>
+          <w:sz w:val="18"/>
+          <w:szCs w:val="18"/>
+        </w:rPr>
         <w:tab/>
         <w:tab/>
-      </w:r>
-      <w:r>
-        <w:rPr>
-          <w:b w:val="false"/>
-          <w:bCs w:val="false"/>
-          <w:i/>
-          <w:iCs/>
-          <w:color w:val="auto"/>
-          <w:sz w:val="18"/>
-          <w:szCs w:val="18"/>
-        </w:rPr>
         <w:t>Mar 2025 – Present</w:t>
       </w:r>
     </w:p>
@@ -340,7 +368,7 @@
         <w:pStyle w:val="ListParagraph"/>
         <w:numPr>
           <w:ilvl w:val="0"/>
-          <w:numId w:val="2"/>
+          <w:numId w:val="1"/>
         </w:numPr>
         <w:spacing w:before="0" w:after="60"/>
         <w:rPr/>
@@ -359,7 +387,7 @@
         <w:pStyle w:val="ListParagraph"/>
         <w:numPr>
           <w:ilvl w:val="0"/>
-          <w:numId w:val="2"/>
+          <w:numId w:val="1"/>
         </w:numPr>
         <w:spacing w:before="0" w:after="60"/>
         <w:rPr/>
@@ -378,7 +406,7 @@
         <w:pStyle w:val="ListParagraph"/>
         <w:numPr>
           <w:ilvl w:val="0"/>
-          <w:numId w:val="2"/>
+          <w:numId w:val="1"/>
         </w:numPr>
         <w:spacing w:before="0" w:after="60"/>
         <w:rPr/>
@@ -417,7 +445,7 @@
         <w:pStyle w:val="ListParagraph"/>
         <w:numPr>
           <w:ilvl w:val="0"/>
-          <w:numId w:val="2"/>
+          <w:numId w:val="1"/>
         </w:numPr>
         <w:spacing w:before="0" w:after="70"/>
         <w:rPr/>
@@ -456,7 +484,7 @@
         <w:pStyle w:val="ListParagraph"/>
         <w:numPr>
           <w:ilvl w:val="0"/>
-          <w:numId w:val="2"/>
+          <w:numId w:val="1"/>
         </w:numPr>
         <w:spacing w:before="0" w:after="70"/>
         <w:rPr/>
@@ -469,15 +497,15 @@
           <w:sz w:val="20"/>
           <w:szCs w:val="20"/>
         </w:rPr>
-        <w:t xml:space="preserve">Enterprise RBAC Task Manager — </w:t>
-      </w:r>
-      <w:r>
-        <w:rPr>
-          <w:color w:val="1A1A1A"/>
-          <w:sz w:val="20"/>
-          <w:szCs w:val="20"/>
-        </w:rPr>
-        <w:t xml:space="preserve">Multi-tenant NX monorepo (NestJS API + Angular 18) with 3-tier RBAC, JWT auth, and full audit logging.  </w:t>
+        <w:t xml:space="preserve">Nexus PM — </w:t>
+      </w:r>
+      <w:r>
+        <w:rPr>
+          <w:color w:val="1A1A1A"/>
+          <w:sz w:val="20"/>
+          <w:szCs w:val="20"/>
+        </w:rPr>
+        <w:t xml:space="preserve">Multi-tenant enterprise project management platform with role-based access (5-tier), Kanban boards, critical-path (CPM) Gantt scheduling, and earned-value metrics (SPI/CPI); full audit trail with searchable logs.  </w:t>
       </w:r>
       <w:r>
         <w:rPr>
@@ -487,7 +515,7 @@
           <w:sz w:val="18"/>
           <w:szCs w:val="18"/>
         </w:rPr>
-        <w:t>[NestJS, Angular 18, TypeScript, TypeORM, SQLite, JWT, NX]</w:t>
+        <w:t>[NestJS, Angular 20, TypeORM, Neon Postgres, JWT, NX]</w:t>
       </w:r>
     </w:p>
     <w:p>
@@ -495,7 +523,7 @@
         <w:pStyle w:val="ListParagraph"/>
         <w:numPr>
           <w:ilvl w:val="0"/>
-          <w:numId w:val="2"/>
+          <w:numId w:val="1"/>
         </w:numPr>
         <w:spacing w:before="0" w:after="70"/>
         <w:rPr/>
@@ -534,46 +562,7 @@
         <w:pStyle w:val="ListParagraph"/>
         <w:numPr>
           <w:ilvl w:val="0"/>
-          <w:numId w:val="2"/>
-        </w:numPr>
-        <w:spacing w:before="0" w:after="70"/>
-        <w:rPr/>
-      </w:pPr>
-      <w:r>
-        <w:rPr>
-          <w:b/>
-          <w:bCs/>
-          <w:color w:val="1A1A1A"/>
-          <w:sz w:val="20"/>
-          <w:szCs w:val="20"/>
-        </w:rPr>
-        <w:t xml:space="preserve">Nexus PM — </w:t>
-      </w:r>
-      <w:r>
-        <w:rPr>
-          <w:color w:val="1A1A1A"/>
-          <w:sz w:val="20"/>
-          <w:szCs w:val="20"/>
-        </w:rPr>
-        <w:t xml:space="preserve">Multi-tenant project workspace with RBAC, Kanban, WBS, critical-path scheduling, earned-value metrics, and full audit trail.  </w:t>
-      </w:r>
-      <w:r>
-        <w:rPr>
-          <w:i/>
-          <w:iCs/>
-          <w:color w:val="555555"/>
-          <w:sz w:val="18"/>
-          <w:szCs w:val="18"/>
-        </w:rPr>
-        <w:t>[NestJS, Angular, TypeORM, Neon, Docker, JWT]</w:t>
-      </w:r>
-    </w:p>
-    <w:p>
-      <w:pPr>
-        <w:pStyle w:val="ListParagraph"/>
-        <w:numPr>
-          <w:ilvl w:val="0"/>
-          <w:numId w:val="2"/>
+          <w:numId w:val="1"/>
         </w:numPr>
         <w:spacing w:before="0" w:after="70"/>
         <w:rPr/>
@@ -777,42 +766,7 @@
         </w:rPr>
         <w:tab/>
         <w:tab/>
-      </w:r>
-      <w:r>
-        <w:rPr>
-          <w:b w:val="false"/>
-          <w:bCs w:val="false"/>
-          <w:i/>
-          <w:iCs/>
-          <w:color w:val="auto"/>
-          <w:sz w:val="18"/>
-          <w:szCs w:val="18"/>
-        </w:rPr>
-        <w:t>Expected Spring</w:t>
-      </w:r>
-      <w:r>
-        <w:rPr>
-          <w:b w:val="false"/>
-          <w:bCs w:val="false"/>
-          <w:i/>
-          <w:iCs/>
-          <w:color w:val="auto"/>
-          <w:sz w:val="18"/>
-          <w:szCs w:val="18"/>
-        </w:rPr>
-        <w:t xml:space="preserve"> 202</w:t>
-      </w:r>
-      <w:r>
-        <w:rPr>
-          <w:b w:val="false"/>
-          <w:bCs w:val="false"/>
-          <w:i/>
-          <w:iCs/>
-          <w:color w:val="auto"/>
-          <w:sz w:val="18"/>
-          <w:szCs w:val="18"/>
-        </w:rPr>
-        <w:t>8</w:t>
+        <w:t>Expected Spring 2028</w:t>
       </w:r>
     </w:p>
     <w:p>
@@ -833,7 +787,7 @@
           <w:sz w:val="20"/>
           <w:szCs w:val="20"/>
         </w:rPr>
-        <w:t xml:space="preserve">B.S. in Computer Science, University of Texas at Dallas, Richardson, TX                        </w:t>
+        <w:t>B.S. in Computer Science, University of Texas at Dallas, Richardson, TX</w:t>
       </w:r>
       <w:r>
         <w:rPr>
@@ -844,19 +798,7 @@
           <w:szCs w:val="18"/>
         </w:rPr>
         <w:tab/>
-        <w:t xml:space="preserve">     </w:t>
         <w:tab/>
-      </w:r>
-      <w:r>
-        <w:rPr>
-          <w:b w:val="false"/>
-          <w:bCs w:val="false"/>
-          <w:i/>
-          <w:iCs/>
-          <w:color w:val="auto"/>
-          <w:sz w:val="18"/>
-          <w:szCs w:val="18"/>
-        </w:rPr>
         <w:t>Graduated Fall 2022</w:t>
       </w:r>
     </w:p>
@@ -902,7 +844,6 @@
         </w:tabs>
         <w:ind w:start="1080" w:hanging="360"/>
       </w:pPr>
-      <w:rPr/>
     </w:lvl>
     <w:lvl w:ilvl="2">
       <w:start w:val="1"/>
@@ -915,7 +856,6 @@
         </w:tabs>
         <w:ind w:start="1440" w:hanging="360"/>
       </w:pPr>
-      <w:rPr/>
     </w:lvl>
     <w:lvl w:ilvl="3">
       <w:start w:val="1"/>
@@ -928,7 +868,6 @@
         </w:tabs>
         <w:ind w:start="1800" w:hanging="360"/>
       </w:pPr>
-      <w:rPr/>
     </w:lvl>
     <w:lvl w:ilvl="4">
       <w:start w:val="1"/>
@@ -941,7 +880,6 @@
         </w:tabs>
         <w:ind w:start="2160" w:hanging="360"/>
       </w:pPr>
-      <w:rPr/>
     </w:lvl>
     <w:lvl w:ilvl="5">
       <w:start w:val="1"/>
@@ -954,7 +892,6 @@
         </w:tabs>
         <w:ind w:start="2520" w:hanging="360"/>
       </w:pPr>
-      <w:rPr/>
     </w:lvl>
     <w:lvl w:ilvl="6">
       <w:start w:val="1"/>
@@ -967,7 +904,6 @@
         </w:tabs>
         <w:ind w:start="2880" w:hanging="360"/>
       </w:pPr>
-      <w:rPr/>
     </w:lvl>
     <w:lvl w:ilvl="7">
       <w:start w:val="1"/>
@@ -980,7 +916,6 @@
         </w:tabs>
         <w:ind w:start="3240" w:hanging="360"/>
       </w:pPr>
-      <w:rPr/>
     </w:lvl>
     <w:lvl w:ilvl="8">
       <w:start w:val="1"/>
@@ -993,131 +928,9 @@
         </w:tabs>
         <w:ind w:start="3600" w:hanging="360"/>
       </w:pPr>
-      <w:rPr/>
     </w:lvl>
   </w:abstractNum>
   <w:abstractNum w:abstractNumId="2">
-    <w:lvl w:ilvl="0">
-      <w:start w:val="1"/>
-      <w:numFmt w:val="bullet"/>
-      <w:lvlText w:val=""/>
-      <w:lvlJc w:val="start"/>
-      <w:pPr>
-        <w:tabs>
-          <w:tab w:val="num" w:pos="0"/>
-        </w:tabs>
-        <w:ind w:start="259" w:hanging="201"/>
-      </w:pPr>
-      <w:rPr>
-        <w:rFonts w:ascii="Symbol" w:hAnsi="Symbol" w:cs="Symbol" w:hint="default"/>
-      </w:rPr>
-    </w:lvl>
-    <w:lvl w:ilvl="1">
-      <w:start w:val="1"/>
-      <w:numFmt w:val="decimal"/>
-      <w:lvlText w:val="%2."/>
-      <w:lvlJc w:val="start"/>
-      <w:pPr>
-        <w:tabs>
-          <w:tab w:val="num" w:pos="1080"/>
-        </w:tabs>
-        <w:ind w:start="1080" w:hanging="360"/>
-      </w:pPr>
-      <w:rPr/>
-    </w:lvl>
-    <w:lvl w:ilvl="2">
-      <w:start w:val="1"/>
-      <w:numFmt w:val="decimal"/>
-      <w:lvlText w:val="%3."/>
-      <w:lvlJc w:val="start"/>
-      <w:pPr>
-        <w:tabs>
-          <w:tab w:val="num" w:pos="1440"/>
-        </w:tabs>
-        <w:ind w:start="1440" w:hanging="360"/>
-      </w:pPr>
-      <w:rPr/>
-    </w:lvl>
-    <w:lvl w:ilvl="3">
-      <w:start w:val="1"/>
-      <w:numFmt w:val="decimal"/>
-      <w:lvlText w:val="%4."/>
-      <w:lvlJc w:val="start"/>
-      <w:pPr>
-        <w:tabs>
-          <w:tab w:val="num" w:pos="1800"/>
-        </w:tabs>
-        <w:ind w:start="1800" w:hanging="360"/>
-      </w:pPr>
-      <w:rPr/>
-    </w:lvl>
-    <w:lvl w:ilvl="4">
-      <w:start w:val="1"/>
-      <w:numFmt w:val="decimal"/>
-      <w:lvlText w:val="%5."/>
-      <w:lvlJc w:val="start"/>
-      <w:pPr>
-        <w:tabs>
-          <w:tab w:val="num" w:pos="2160"/>
-        </w:tabs>
-        <w:ind w:start="2160" w:hanging="360"/>
-      </w:pPr>
-      <w:rPr/>
-    </w:lvl>
-    <w:lvl w:ilvl="5">
-      <w:start w:val="1"/>
-      <w:numFmt w:val="decimal"/>
-      <w:lvlText w:val="%6."/>
-      <w:lvlJc w:val="start"/>
-      <w:pPr>
-        <w:tabs>
-          <w:tab w:val="num" w:pos="2520"/>
-        </w:tabs>
-        <w:ind w:start="2520" w:hanging="360"/>
-      </w:pPr>
-      <w:rPr/>
-    </w:lvl>
-    <w:lvl w:ilvl="6">
-      <w:start w:val="1"/>
-      <w:numFmt w:val="decimal"/>
-      <w:lvlText w:val="%7."/>
-      <w:lvlJc w:val="start"/>
-      <w:pPr>
-        <w:tabs>
-          <w:tab w:val="num" w:pos="2880"/>
-        </w:tabs>
-        <w:ind w:start="2880" w:hanging="360"/>
-      </w:pPr>
-      <w:rPr/>
-    </w:lvl>
-    <w:lvl w:ilvl="7">
-      <w:start w:val="1"/>
-      <w:numFmt w:val="decimal"/>
-      <w:lvlText w:val="%8."/>
-      <w:lvlJc w:val="start"/>
-      <w:pPr>
-        <w:tabs>
-          <w:tab w:val="num" w:pos="3240"/>
-        </w:tabs>
-        <w:ind w:start="3240" w:hanging="360"/>
-      </w:pPr>
-      <w:rPr/>
-    </w:lvl>
-    <w:lvl w:ilvl="8">
-      <w:start w:val="1"/>
-      <w:numFmt w:val="decimal"/>
-      <w:lvlText w:val="%9."/>
-      <w:lvlJc w:val="start"/>
-      <w:pPr>
-        <w:tabs>
-          <w:tab w:val="num" w:pos="3600"/>
-        </w:tabs>
-        <w:ind w:start="3600" w:hanging="360"/>
-      </w:pPr>
-      <w:rPr/>
-    </w:lvl>
-  </w:abstractNum>
-  <w:abstractNum w:abstractNumId="3">
     <w:lvl w:ilvl="0">
       <w:start w:val="1"/>
       <w:numFmt w:val="none"/>
@@ -1243,10 +1056,7 @@
     <w:abstractNumId w:val="2"/>
   </w:num>
   <w:num w:numId="3">
-    <w:abstractNumId w:val="3"/>
-  </w:num>
-  <w:num w:numId="4">
-    <w:abstractNumId w:val="2"/>
+    <w:abstractNumId w:val="1"/>
     <w:lvlOverride w:ilvl="0">
       <w:startOverride w:val="1"/>
     </w:lvlOverride>
@@ -1274,7 +1084,6 @@
     <w:qFormat/>
     <w:pPr>
       <w:widowControl/>
-      <w:suppressAutoHyphens w:val="true"/>
       <w:bidi w:val="0"/>
       <w:spacing w:before="0" w:after="0"/>
       <w:jc w:val="start"/>
@@ -1359,18 +1168,11 @@
       <w:u w:val="single"/>
     </w:rPr>
   </w:style>
-  <w:style w:type="character" w:styleId="FootnoteCharactersuser">
-    <w:name w:val="Footnote Characters (user)"/>
+  <w:style w:type="character" w:styleId="FootnoteCharacters">
+    <w:name w:val="Footnote Characters"/>
     <w:uiPriority w:val="99"/>
     <w:semiHidden/>
     <w:unhideWhenUsed/>
-    <w:qFormat/>
-    <w:rPr>
-      <w:vertAlign w:val="superscript"/>
-    </w:rPr>
-  </w:style>
-  <w:style w:type="character" w:styleId="FootnoteCharacters">
-    <w:name w:val="Footnote Characters"/>
     <w:qFormat/>
     <w:rPr>
       <w:vertAlign w:val="superscript"/>
@@ -1394,18 +1196,11 @@
       <w:szCs w:val="20"/>
     </w:rPr>
   </w:style>
-  <w:style w:type="character" w:styleId="EndnoteCharactersuser">
-    <w:name w:val="Endnote Characters (user)"/>
+  <w:style w:type="character" w:styleId="EndnoteCharacters">
+    <w:name w:val="Endnote Characters"/>
     <w:uiPriority w:val="99"/>
     <w:semiHidden/>
     <w:unhideWhenUsed/>
-    <w:qFormat/>
-    <w:rPr>
-      <w:vertAlign w:val="superscript"/>
-    </w:rPr>
-  </w:style>
-  <w:style w:type="character" w:styleId="EndnoteCharacters">
-    <w:name w:val="Endnote Characters"/>
     <w:qFormat/>
     <w:rPr>
       <w:vertAlign w:val="superscript"/>
@@ -1502,7 +1297,6 @@
     <w:qFormat/>
     <w:pPr>
       <w:widowControl/>
-      <w:suppressAutoHyphens w:val="true"/>
       <w:bidi w:val="0"/>
       <w:spacing w:before="0" w:after="0"/>
       <w:jc w:val="start"/>
@@ -1523,7 +1317,6 @@
     <w:qFormat/>
     <w:pPr>
       <w:widowControl/>
-      <w:suppressAutoHyphens w:val="true"/>
       <w:bidi w:val="0"/>
       <w:spacing w:before="0" w:after="0"/>
       <w:jc w:val="start"/>

</xml_diff>